<commit_message>
Updated Razorpay payment amount based on report count
</commit_message>
<xml_diff>
--- a/public/test_2.docx
+++ b/public/test_2.docx
@@ -1933,42 +1933,36 @@
     </w:p>
     <w:p>
       <w:pPr>
-        <w:tabs>
-          <w:tab w:val="left" w:pos="2612"/>
-        </w:tabs>
+        <w:spacing w:before="56"/>
+        <w:ind w:left="444"/>
         <w:jc w:val="center"/>
         <w:rPr>
           <w:b/>
           <w:sz w:val="36"/>
         </w:rPr>
       </w:pPr>
-      <w:r>
+    </w:p>
+    <w:p>
+      <w:pPr>
+        <w:spacing w:before="56"/>
+        <w:ind w:left="444"/>
+        <w:jc w:val="center"/>
         <w:rPr>
           <w:b/>
           <w:sz w:val="36"/>
         </w:rPr>
-        <w:lastRenderedPageBreak/>
-        <w:t>LIST</w:t>
-      </w:r>
-      <w:r>
-        <w:rPr>
-          <w:b/>
-          <w:spacing w:val="-14"/>
-          <w:sz w:val="36"/>
-        </w:rPr>
-        <w:t xml:space="preserve"> </w:t>
-      </w:r>
+      </w:pPr>
       <w:r>
         <w:rPr>
           <w:b/>
           <w:sz w:val="36"/>
         </w:rPr>
-        <w:t>OF</w:t>
+        <w:t>LIST</w:t>
       </w:r>
       <w:r>
         <w:rPr>
           <w:b/>
-          <w:spacing w:val="-16"/>
+          <w:spacing w:val="-20"/>
           <w:sz w:val="36"/>
         </w:rPr>
         <w:t xml:space="preserve"> </w:t>
@@ -1978,305 +1972,2003 @@
           <w:b/>
           <w:sz w:val="36"/>
         </w:rPr>
-        <w:t>FIGURES</w:t>
-      </w:r>
-    </w:p>
-    <w:p>
-      <w:pPr>
-        <w:tabs>
-          <w:tab w:val="left" w:pos="2612"/>
-        </w:tabs>
-        <w:jc w:val="center"/>
+        <w:t>OF</w:t>
+      </w:r>
+      <w:r>
+        <w:rPr>
+          <w:b/>
+          <w:spacing w:val="-22"/>
+          <w:sz w:val="36"/>
+        </w:rPr>
+        <w:t xml:space="preserve"> </w:t>
+      </w:r>
+      <w:r>
         <w:rPr>
           <w:b/>
           <w:sz w:val="36"/>
         </w:rPr>
-      </w:pPr>
+        <w:t>FIGURES</w:t>
+      </w:r>
     </w:p>
     <w:tbl>
       <w:tblPr>
+        <w:tblStyle w:val="TableGrid"/>
+        <w:tblpPr w:leftFromText="180" w:rightFromText="180" w:vertAnchor="text" w:horzAnchor="margin" w:tblpXSpec="center" w:tblpY="133"/>
         <w:tblW w:w="0" w:type="auto"/>
-        <w:tblInd w:w="1376" w:type="dxa"/>
-        <w:tblLayout w:type="fixed"/>
-        <w:tblCellMar>
-          <w:left w:w="0" w:type="dxa"/>
-          <w:right w:w="0" w:type="dxa"/>
-        </w:tblCellMar>
-        <w:tblLook w:val="01E0" w:firstRow="1" w:lastRow="1" w:firstColumn="1" w:lastColumn="1" w:noHBand="0" w:noVBand="0"/>
+        <w:tblBorders>
+          <w:top w:val="none" w:sz="0" w:space="0" w:color="auto"/>
+          <w:left w:val="none" w:sz="0" w:space="0" w:color="auto"/>
+          <w:bottom w:val="none" w:sz="0" w:space="0" w:color="auto"/>
+          <w:right w:val="none" w:sz="0" w:space="0" w:color="auto"/>
+          <w:insideH w:val="none" w:sz="0" w:space="0" w:color="auto"/>
+          <w:insideV w:val="none" w:sz="0" w:space="0" w:color="auto"/>
+        </w:tblBorders>
+        <w:tblLook w:val="04A0" w:firstRow="1" w:lastRow="0" w:firstColumn="1" w:lastColumn="0" w:noHBand="0" w:noVBand="1"/>
       </w:tblPr>
       <w:tblGrid>
-        <w:gridCol w:w="2200"/>
-        <w:gridCol w:w="3601"/>
-        <w:gridCol w:w="2287"/>
+        <w:gridCol w:w="1543"/>
+        <w:gridCol w:w="5839"/>
+        <w:gridCol w:w="2404"/>
       </w:tblGrid>
       <w:tr>
         <w:trPr>
-          <w:trHeight w:val="310"/>
+          <w:trHeight w:val="579"/>
         </w:trPr>
         <w:tc>
           <w:tcPr>
-            <w:tcW w:w="2200" w:type="dxa"/>
-          </w:tcPr>
-          <w:p>
-            <w:pPr>
-              <w:pStyle w:val="TableParagraph"/>
-              <w:spacing w:line="291" w:lineRule="exact"/>
-              <w:ind w:left="50"/>
+            <w:tcW w:w="1543" w:type="dxa"/>
+          </w:tcPr>
+          <w:p>
+            <w:pPr>
+              <w:spacing w:before="56"/>
+              <w:ind w:left="0" w:firstLine="0"/>
+              <w:jc w:val="center"/>
+              <w:rPr>
+                <w:b/>
+              </w:rPr>
+            </w:pPr>
+            <w:proofErr w:type="spellStart"/>
+            <w:r>
+              <w:rPr>
+                <w:b/>
+              </w:rPr>
+              <w:t>Sl</w:t>
+            </w:r>
+            <w:proofErr w:type="spellEnd"/>
+            <w:r>
+              <w:rPr>
+                <w:b/>
+              </w:rPr>
+              <w:t xml:space="preserve"> No.</w:t>
+            </w:r>
+          </w:p>
+        </w:tc>
+        <w:tc>
+          <w:tcPr>
+            <w:tcW w:w="5839" w:type="dxa"/>
+          </w:tcPr>
+          <w:p>
+            <w:pPr>
+              <w:spacing w:before="56"/>
+              <w:ind w:left="0" w:firstLine="0"/>
+              <w:jc w:val="center"/>
               <w:rPr>
                 <w:b/>
                 <w:sz w:val="28"/>
+                <w:szCs w:val="28"/>
               </w:rPr>
             </w:pPr>
             <w:r>
               <w:rPr>
                 <w:b/>
                 <w:sz w:val="28"/>
-              </w:rPr>
-              <w:t>Fig.</w:t>
-            </w:r>
-            <w:r>
-              <w:rPr>
-                <w:b/>
-                <w:spacing w:val="-5"/>
+                <w:szCs w:val="28"/>
+              </w:rPr>
+              <w:t>Figure Name</w:t>
+            </w:r>
+          </w:p>
+        </w:tc>
+        <w:tc>
+          <w:tcPr>
+            <w:tcW w:w="2404" w:type="dxa"/>
+          </w:tcPr>
+          <w:p>
+            <w:pPr>
+              <w:spacing w:before="56"/>
+              <w:ind w:left="0" w:firstLine="0"/>
+              <w:jc w:val="center"/>
+              <w:rPr>
+                <w:b/>
                 <w:sz w:val="28"/>
-              </w:rPr>
-              <w:t xml:space="preserve"> No.</w:t>
-            </w:r>
-          </w:p>
-        </w:tc>
-        <w:tc>
-          <w:tcPr>
-            <w:tcW w:w="3601" w:type="dxa"/>
-          </w:tcPr>
-          <w:p>
-            <w:pPr>
-              <w:pStyle w:val="TableParagraph"/>
-              <w:spacing w:line="291" w:lineRule="exact"/>
-              <w:jc w:val="center"/>
+                <w:szCs w:val="28"/>
+              </w:rPr>
+            </w:pPr>
+            <w:r>
               <w:rPr>
                 <w:b/>
                 <w:sz w:val="28"/>
-              </w:rPr>
-            </w:pPr>
-            <w:r>
-              <w:rPr>
-                <w:b/>
-                <w:sz w:val="28"/>
-              </w:rPr>
-              <w:t>Fig.</w:t>
-            </w:r>
-            <w:r>
-              <w:rPr>
-                <w:b/>
-                <w:spacing w:val="-5"/>
-                <w:sz w:val="28"/>
-              </w:rPr>
-              <w:t xml:space="preserve"> </w:t>
-            </w:r>
-            <w:r>
-              <w:rPr>
-                <w:b/>
-                <w:spacing w:val="-2"/>
-                <w:sz w:val="28"/>
-              </w:rPr>
-              <w:t>Label</w:t>
-            </w:r>
-          </w:p>
-        </w:tc>
-        <w:tc>
-          <w:tcPr>
-            <w:tcW w:w="2287" w:type="dxa"/>
-          </w:tcPr>
-          <w:p>
-            <w:pPr>
-              <w:pStyle w:val="TableParagraph"/>
-              <w:spacing w:line="291" w:lineRule="exact"/>
-              <w:ind w:left="1177"/>
-              <w:rPr>
-                <w:b/>
-                <w:sz w:val="28"/>
-              </w:rPr>
-            </w:pPr>
-            <w:r>
-              <w:rPr>
-                <w:b/>
-                <w:sz w:val="28"/>
-              </w:rPr>
-              <w:t>Page</w:t>
-            </w:r>
-            <w:r>
-              <w:rPr>
-                <w:b/>
-                <w:spacing w:val="-2"/>
-                <w:sz w:val="28"/>
-              </w:rPr>
-              <w:t xml:space="preserve"> </w:t>
-            </w:r>
-            <w:r>
-              <w:rPr>
-                <w:b/>
-                <w:spacing w:val="-5"/>
-                <w:sz w:val="28"/>
-              </w:rPr>
-              <w:t>No.</w:t>
-            </w:r>
+                <w:szCs w:val="28"/>
+              </w:rPr>
+              <w:t>Page No.</w:t>
+            </w:r>
+          </w:p>
+        </w:tc>
+      </w:tr>
+      <w:tr>
+        <w:trPr>
+          <w:trHeight w:val="353"/>
+        </w:trPr>
+        <w:tc>
+          <w:tcPr>
+            <w:tcW w:w="1543" w:type="dxa"/>
+          </w:tcPr>
+          <w:p>
+            <w:pPr>
+              <w:spacing w:before="56"/>
+              <w:ind w:left="0" w:firstLine="0"/>
+              <w:jc w:val="center"/>
+              <w:rPr>
+                <w:b/>
+                <w:sz w:val="20"/>
+                <w:szCs w:val="20"/>
+              </w:rPr>
+            </w:pPr>
+            <w:r>
+              <w:rPr>
+                <w:b/>
+                <w:sz w:val="20"/>
+                <w:szCs w:val="20"/>
+              </w:rPr>
+              <w:t>1</w:t>
+            </w:r>
+          </w:p>
+        </w:tc>
+        <w:tc>
+          <w:tcPr>
+            <w:tcW w:w="5839" w:type="dxa"/>
+          </w:tcPr>
+          <w:p>
+            <w:pPr>
+              <w:spacing w:before="56"/>
+              <w:ind w:left="0" w:firstLine="0"/>
+              <w:jc w:val="center"/>
+              <w:rPr>
+                <w:b/>
+                <w:sz w:val="20"/>
+                <w:szCs w:val="20"/>
+              </w:rPr>
+            </w:pPr>
+          </w:p>
+        </w:tc>
+        <w:tc>
+          <w:tcPr>
+            <w:tcW w:w="2404" w:type="dxa"/>
+          </w:tcPr>
+          <w:p>
+            <w:pPr>
+              <w:spacing w:before="56"/>
+              <w:ind w:left="0" w:firstLine="0"/>
+              <w:jc w:val="center"/>
+              <w:rPr>
+                <w:b/>
+                <w:sz w:val="20"/>
+                <w:szCs w:val="20"/>
+              </w:rPr>
+            </w:pPr>
+          </w:p>
+        </w:tc>
+      </w:tr>
+      <w:tr>
+        <w:trPr>
+          <w:trHeight w:val="426"/>
+        </w:trPr>
+        <w:tc>
+          <w:tcPr>
+            <w:tcW w:w="1543" w:type="dxa"/>
+          </w:tcPr>
+          <w:p>
+            <w:pPr>
+              <w:spacing w:before="56"/>
+              <w:ind w:left="0" w:firstLine="0"/>
+              <w:jc w:val="center"/>
+              <w:rPr>
+                <w:b/>
+                <w:sz w:val="20"/>
+                <w:szCs w:val="20"/>
+              </w:rPr>
+            </w:pPr>
+            <w:r>
+              <w:rPr>
+                <w:b/>
+                <w:sz w:val="20"/>
+                <w:szCs w:val="20"/>
+              </w:rPr>
+              <w:t>2</w:t>
+            </w:r>
+          </w:p>
+        </w:tc>
+        <w:tc>
+          <w:tcPr>
+            <w:tcW w:w="5839" w:type="dxa"/>
+          </w:tcPr>
+          <w:p>
+            <w:pPr>
+              <w:spacing w:before="56"/>
+              <w:ind w:left="0" w:firstLine="0"/>
+              <w:jc w:val="center"/>
+              <w:rPr>
+                <w:b/>
+                <w:sz w:val="20"/>
+                <w:szCs w:val="20"/>
+              </w:rPr>
+            </w:pPr>
+          </w:p>
+        </w:tc>
+        <w:tc>
+          <w:tcPr>
+            <w:tcW w:w="2404" w:type="dxa"/>
+          </w:tcPr>
+          <w:p>
+            <w:pPr>
+              <w:spacing w:before="56"/>
+              <w:ind w:left="0" w:firstLine="0"/>
+              <w:jc w:val="center"/>
+              <w:rPr>
+                <w:b/>
+                <w:sz w:val="20"/>
+                <w:szCs w:val="20"/>
+              </w:rPr>
+            </w:pPr>
+          </w:p>
+        </w:tc>
+      </w:tr>
+      <w:tr>
+        <w:trPr>
+          <w:trHeight w:val="183"/>
+        </w:trPr>
+        <w:tc>
+          <w:tcPr>
+            <w:tcW w:w="1543" w:type="dxa"/>
+          </w:tcPr>
+          <w:p>
+            <w:pPr>
+              <w:spacing w:before="56"/>
+              <w:ind w:left="0" w:firstLine="0"/>
+              <w:jc w:val="center"/>
+              <w:rPr>
+                <w:b/>
+                <w:sz w:val="20"/>
+                <w:szCs w:val="20"/>
+              </w:rPr>
+            </w:pPr>
+            <w:r>
+              <w:rPr>
+                <w:b/>
+                <w:sz w:val="20"/>
+                <w:szCs w:val="20"/>
+              </w:rPr>
+              <w:t>3</w:t>
+            </w:r>
+          </w:p>
+        </w:tc>
+        <w:tc>
+          <w:tcPr>
+            <w:tcW w:w="5839" w:type="dxa"/>
+          </w:tcPr>
+          <w:p>
+            <w:pPr>
+              <w:spacing w:before="56"/>
+              <w:ind w:left="0" w:firstLine="0"/>
+              <w:jc w:val="center"/>
+              <w:rPr>
+                <w:b/>
+                <w:sz w:val="20"/>
+                <w:szCs w:val="20"/>
+              </w:rPr>
+            </w:pPr>
+          </w:p>
+        </w:tc>
+        <w:tc>
+          <w:tcPr>
+            <w:tcW w:w="2404" w:type="dxa"/>
+          </w:tcPr>
+          <w:p>
+            <w:pPr>
+              <w:spacing w:before="56"/>
+              <w:ind w:left="0" w:firstLine="0"/>
+              <w:jc w:val="center"/>
+              <w:rPr>
+                <w:b/>
+                <w:sz w:val="20"/>
+                <w:szCs w:val="20"/>
+              </w:rPr>
+            </w:pPr>
+          </w:p>
+        </w:tc>
+      </w:tr>
+      <w:tr>
+        <w:trPr>
+          <w:trHeight w:val="414"/>
+        </w:trPr>
+        <w:tc>
+          <w:tcPr>
+            <w:tcW w:w="1543" w:type="dxa"/>
+          </w:tcPr>
+          <w:p>
+            <w:pPr>
+              <w:spacing w:before="56"/>
+              <w:ind w:left="0" w:firstLine="0"/>
+              <w:jc w:val="center"/>
+              <w:rPr>
+                <w:b/>
+                <w:sz w:val="20"/>
+                <w:szCs w:val="20"/>
+              </w:rPr>
+            </w:pPr>
+            <w:r>
+              <w:rPr>
+                <w:b/>
+                <w:sz w:val="20"/>
+                <w:szCs w:val="20"/>
+              </w:rPr>
+              <w:t>4</w:t>
+            </w:r>
+          </w:p>
+        </w:tc>
+        <w:tc>
+          <w:tcPr>
+            <w:tcW w:w="5839" w:type="dxa"/>
+          </w:tcPr>
+          <w:p>
+            <w:pPr>
+              <w:spacing w:before="56"/>
+              <w:ind w:left="0" w:firstLine="0"/>
+              <w:jc w:val="center"/>
+              <w:rPr>
+                <w:b/>
+                <w:sz w:val="20"/>
+                <w:szCs w:val="20"/>
+              </w:rPr>
+            </w:pPr>
+          </w:p>
+        </w:tc>
+        <w:tc>
+          <w:tcPr>
+            <w:tcW w:w="2404" w:type="dxa"/>
+          </w:tcPr>
+          <w:p>
+            <w:pPr>
+              <w:spacing w:before="56"/>
+              <w:ind w:left="0" w:firstLine="0"/>
+              <w:jc w:val="center"/>
+              <w:rPr>
+                <w:b/>
+                <w:sz w:val="20"/>
+                <w:szCs w:val="20"/>
+              </w:rPr>
+            </w:pPr>
+          </w:p>
+        </w:tc>
+      </w:tr>
+      <w:tr>
+        <w:trPr>
+          <w:trHeight w:val="330"/>
+        </w:trPr>
+        <w:tc>
+          <w:tcPr>
+            <w:tcW w:w="1543" w:type="dxa"/>
+          </w:tcPr>
+          <w:p>
+            <w:pPr>
+              <w:spacing w:before="56"/>
+              <w:ind w:left="0" w:firstLine="0"/>
+              <w:jc w:val="center"/>
+              <w:rPr>
+                <w:b/>
+                <w:sz w:val="20"/>
+                <w:szCs w:val="20"/>
+              </w:rPr>
+            </w:pPr>
+            <w:r>
+              <w:rPr>
+                <w:b/>
+                <w:sz w:val="20"/>
+                <w:szCs w:val="20"/>
+              </w:rPr>
+              <w:t>5</w:t>
+            </w:r>
+          </w:p>
+        </w:tc>
+        <w:tc>
+          <w:tcPr>
+            <w:tcW w:w="5839" w:type="dxa"/>
+          </w:tcPr>
+          <w:p>
+            <w:pPr>
+              <w:spacing w:before="56"/>
+              <w:ind w:left="0" w:firstLine="0"/>
+              <w:jc w:val="center"/>
+              <w:rPr>
+                <w:b/>
+                <w:sz w:val="20"/>
+                <w:szCs w:val="20"/>
+              </w:rPr>
+            </w:pPr>
+          </w:p>
+        </w:tc>
+        <w:tc>
+          <w:tcPr>
+            <w:tcW w:w="2404" w:type="dxa"/>
+          </w:tcPr>
+          <w:p>
+            <w:pPr>
+              <w:spacing w:before="56"/>
+              <w:ind w:left="0" w:firstLine="0"/>
+              <w:jc w:val="center"/>
+              <w:rPr>
+                <w:b/>
+                <w:sz w:val="20"/>
+                <w:szCs w:val="20"/>
+              </w:rPr>
+            </w:pPr>
+          </w:p>
+        </w:tc>
+      </w:tr>
+      <w:tr>
+        <w:trPr>
+          <w:trHeight w:val="367"/>
+        </w:trPr>
+        <w:tc>
+          <w:tcPr>
+            <w:tcW w:w="1543" w:type="dxa"/>
+          </w:tcPr>
+          <w:p>
+            <w:pPr>
+              <w:spacing w:before="56"/>
+              <w:ind w:left="0" w:firstLine="0"/>
+              <w:jc w:val="center"/>
+              <w:rPr>
+                <w:b/>
+                <w:sz w:val="20"/>
+                <w:szCs w:val="20"/>
+              </w:rPr>
+            </w:pPr>
+            <w:r>
+              <w:rPr>
+                <w:b/>
+                <w:sz w:val="20"/>
+                <w:szCs w:val="20"/>
+              </w:rPr>
+              <w:t>6</w:t>
+            </w:r>
+          </w:p>
+        </w:tc>
+        <w:tc>
+          <w:tcPr>
+            <w:tcW w:w="5839" w:type="dxa"/>
+          </w:tcPr>
+          <w:p>
+            <w:pPr>
+              <w:spacing w:before="56"/>
+              <w:ind w:left="0" w:firstLine="0"/>
+              <w:jc w:val="center"/>
+              <w:rPr>
+                <w:b/>
+                <w:sz w:val="20"/>
+                <w:szCs w:val="20"/>
+              </w:rPr>
+            </w:pPr>
+          </w:p>
+        </w:tc>
+        <w:tc>
+          <w:tcPr>
+            <w:tcW w:w="2404" w:type="dxa"/>
+          </w:tcPr>
+          <w:p>
+            <w:pPr>
+              <w:spacing w:before="56"/>
+              <w:ind w:left="0" w:firstLine="0"/>
+              <w:rPr>
+                <w:b/>
+                <w:sz w:val="20"/>
+                <w:szCs w:val="20"/>
+              </w:rPr>
+            </w:pPr>
+          </w:p>
+        </w:tc>
+      </w:tr>
+      <w:tr>
+        <w:trPr>
+          <w:trHeight w:val="90"/>
+        </w:trPr>
+        <w:tc>
+          <w:tcPr>
+            <w:tcW w:w="1543" w:type="dxa"/>
+          </w:tcPr>
+          <w:p>
+            <w:pPr>
+              <w:spacing w:before="56"/>
+              <w:ind w:left="0" w:firstLine="0"/>
+              <w:jc w:val="center"/>
+              <w:rPr>
+                <w:b/>
+                <w:sz w:val="20"/>
+                <w:szCs w:val="20"/>
+              </w:rPr>
+            </w:pPr>
+            <w:r>
+              <w:rPr>
+                <w:b/>
+                <w:sz w:val="20"/>
+                <w:szCs w:val="20"/>
+              </w:rPr>
+              <w:t>7</w:t>
+            </w:r>
+          </w:p>
+        </w:tc>
+        <w:tc>
+          <w:tcPr>
+            <w:tcW w:w="5839" w:type="dxa"/>
+          </w:tcPr>
+          <w:p>
+            <w:pPr>
+              <w:spacing w:before="56"/>
+              <w:ind w:left="0" w:firstLine="0"/>
+              <w:jc w:val="center"/>
+              <w:rPr>
+                <w:b/>
+                <w:sz w:val="20"/>
+                <w:szCs w:val="20"/>
+              </w:rPr>
+            </w:pPr>
+          </w:p>
+        </w:tc>
+        <w:tc>
+          <w:tcPr>
+            <w:tcW w:w="2404" w:type="dxa"/>
+          </w:tcPr>
+          <w:p>
+            <w:pPr>
+              <w:spacing w:before="56"/>
+              <w:ind w:left="0" w:firstLine="0"/>
+              <w:rPr>
+                <w:b/>
+                <w:sz w:val="20"/>
+                <w:szCs w:val="20"/>
+              </w:rPr>
+            </w:pPr>
+          </w:p>
+        </w:tc>
+      </w:tr>
+      <w:tr>
+        <w:trPr>
+          <w:trHeight w:val="142"/>
+        </w:trPr>
+        <w:tc>
+          <w:tcPr>
+            <w:tcW w:w="1543" w:type="dxa"/>
+          </w:tcPr>
+          <w:p>
+            <w:pPr>
+              <w:spacing w:before="56"/>
+              <w:ind w:left="0" w:firstLine="0"/>
+              <w:jc w:val="center"/>
+              <w:rPr>
+                <w:b/>
+                <w:sz w:val="20"/>
+                <w:szCs w:val="20"/>
+              </w:rPr>
+            </w:pPr>
+            <w:r>
+              <w:rPr>
+                <w:b/>
+                <w:sz w:val="20"/>
+                <w:szCs w:val="20"/>
+              </w:rPr>
+              <w:t>8</w:t>
+            </w:r>
+          </w:p>
+        </w:tc>
+        <w:tc>
+          <w:tcPr>
+            <w:tcW w:w="5839" w:type="dxa"/>
+          </w:tcPr>
+          <w:p>
+            <w:pPr>
+              <w:spacing w:before="56"/>
+              <w:ind w:left="0" w:firstLine="0"/>
+              <w:jc w:val="center"/>
+              <w:rPr>
+                <w:b/>
+                <w:sz w:val="20"/>
+                <w:szCs w:val="20"/>
+              </w:rPr>
+            </w:pPr>
+          </w:p>
+        </w:tc>
+        <w:tc>
+          <w:tcPr>
+            <w:tcW w:w="2404" w:type="dxa"/>
+          </w:tcPr>
+          <w:p>
+            <w:pPr>
+              <w:spacing w:before="56"/>
+              <w:ind w:left="0" w:firstLine="0"/>
+              <w:rPr>
+                <w:b/>
+                <w:sz w:val="20"/>
+                <w:szCs w:val="20"/>
+              </w:rPr>
+            </w:pPr>
+          </w:p>
+        </w:tc>
+      </w:tr>
+      <w:tr>
+        <w:trPr>
+          <w:trHeight w:val="339"/>
+        </w:trPr>
+        <w:tc>
+          <w:tcPr>
+            <w:tcW w:w="1543" w:type="dxa"/>
+          </w:tcPr>
+          <w:p>
+            <w:pPr>
+              <w:spacing w:before="56"/>
+              <w:ind w:left="0" w:firstLine="0"/>
+              <w:jc w:val="center"/>
+              <w:rPr>
+                <w:b/>
+                <w:sz w:val="20"/>
+                <w:szCs w:val="20"/>
+              </w:rPr>
+            </w:pPr>
+            <w:r>
+              <w:rPr>
+                <w:b/>
+                <w:sz w:val="20"/>
+                <w:szCs w:val="20"/>
+              </w:rPr>
+              <w:t>9</w:t>
+            </w:r>
+          </w:p>
+        </w:tc>
+        <w:tc>
+          <w:tcPr>
+            <w:tcW w:w="5839" w:type="dxa"/>
+          </w:tcPr>
+          <w:p>
+            <w:pPr>
+              <w:spacing w:before="56"/>
+              <w:ind w:left="0" w:firstLine="0"/>
+              <w:jc w:val="center"/>
+              <w:rPr>
+                <w:b/>
+                <w:sz w:val="20"/>
+                <w:szCs w:val="20"/>
+              </w:rPr>
+            </w:pPr>
+          </w:p>
+        </w:tc>
+        <w:tc>
+          <w:tcPr>
+            <w:tcW w:w="2404" w:type="dxa"/>
+          </w:tcPr>
+          <w:p>
+            <w:pPr>
+              <w:spacing w:before="56"/>
+              <w:ind w:left="0" w:firstLine="0"/>
+              <w:rPr>
+                <w:b/>
+                <w:sz w:val="20"/>
+                <w:szCs w:val="20"/>
+              </w:rPr>
+            </w:pPr>
+          </w:p>
+        </w:tc>
+      </w:tr>
+      <w:tr>
+        <w:trPr>
+          <w:trHeight w:val="203"/>
+        </w:trPr>
+        <w:tc>
+          <w:tcPr>
+            <w:tcW w:w="1543" w:type="dxa"/>
+          </w:tcPr>
+          <w:p>
+            <w:pPr>
+              <w:spacing w:before="56"/>
+              <w:ind w:left="0" w:firstLine="0"/>
+              <w:jc w:val="center"/>
+              <w:rPr>
+                <w:b/>
+                <w:sz w:val="20"/>
+                <w:szCs w:val="20"/>
+              </w:rPr>
+            </w:pPr>
+            <w:r>
+              <w:rPr>
+                <w:b/>
+                <w:sz w:val="20"/>
+                <w:szCs w:val="20"/>
+              </w:rPr>
+              <w:t>10</w:t>
+            </w:r>
+          </w:p>
+        </w:tc>
+        <w:tc>
+          <w:tcPr>
+            <w:tcW w:w="5839" w:type="dxa"/>
+          </w:tcPr>
+          <w:p>
+            <w:pPr>
+              <w:spacing w:before="56"/>
+              <w:ind w:left="0" w:firstLine="0"/>
+              <w:jc w:val="center"/>
+              <w:rPr>
+                <w:b/>
+                <w:sz w:val="20"/>
+                <w:szCs w:val="20"/>
+              </w:rPr>
+            </w:pPr>
+          </w:p>
+        </w:tc>
+        <w:tc>
+          <w:tcPr>
+            <w:tcW w:w="2404" w:type="dxa"/>
+          </w:tcPr>
+          <w:p>
+            <w:pPr>
+              <w:spacing w:before="56"/>
+              <w:ind w:left="0" w:firstLine="0"/>
+              <w:rPr>
+                <w:b/>
+                <w:sz w:val="20"/>
+                <w:szCs w:val="20"/>
+              </w:rPr>
+            </w:pPr>
+          </w:p>
+        </w:tc>
+      </w:tr>
+      <w:tr>
+        <w:trPr>
+          <w:trHeight w:val="397"/>
+        </w:trPr>
+        <w:tc>
+          <w:tcPr>
+            <w:tcW w:w="1543" w:type="dxa"/>
+          </w:tcPr>
+          <w:p>
+            <w:pPr>
+              <w:spacing w:before="56"/>
+              <w:ind w:left="0" w:firstLine="0"/>
+              <w:jc w:val="center"/>
+              <w:rPr>
+                <w:b/>
+                <w:sz w:val="20"/>
+                <w:szCs w:val="20"/>
+              </w:rPr>
+            </w:pPr>
+            <w:r>
+              <w:rPr>
+                <w:b/>
+                <w:sz w:val="20"/>
+                <w:szCs w:val="20"/>
+              </w:rPr>
+              <w:t>11</w:t>
+            </w:r>
+          </w:p>
+        </w:tc>
+        <w:tc>
+          <w:tcPr>
+            <w:tcW w:w="5839" w:type="dxa"/>
+          </w:tcPr>
+          <w:p>
+            <w:pPr>
+              <w:spacing w:before="56"/>
+              <w:ind w:left="0" w:firstLine="0"/>
+              <w:jc w:val="center"/>
+              <w:rPr>
+                <w:b/>
+                <w:sz w:val="20"/>
+                <w:szCs w:val="20"/>
+              </w:rPr>
+            </w:pPr>
+          </w:p>
+        </w:tc>
+        <w:tc>
+          <w:tcPr>
+            <w:tcW w:w="2404" w:type="dxa"/>
+          </w:tcPr>
+          <w:p>
+            <w:pPr>
+              <w:spacing w:before="56"/>
+              <w:ind w:left="0" w:firstLine="0"/>
+              <w:rPr>
+                <w:b/>
+                <w:sz w:val="20"/>
+                <w:szCs w:val="20"/>
+              </w:rPr>
+            </w:pPr>
+          </w:p>
+        </w:tc>
+      </w:tr>
+      <w:tr>
+        <w:trPr>
+          <w:trHeight w:val="293"/>
+        </w:trPr>
+        <w:tc>
+          <w:tcPr>
+            <w:tcW w:w="1543" w:type="dxa"/>
+          </w:tcPr>
+          <w:p>
+            <w:pPr>
+              <w:spacing w:before="56"/>
+              <w:ind w:left="0" w:firstLine="0"/>
+              <w:jc w:val="center"/>
+              <w:rPr>
+                <w:b/>
+                <w:sz w:val="20"/>
+                <w:szCs w:val="20"/>
+              </w:rPr>
+            </w:pPr>
+            <w:r>
+              <w:rPr>
+                <w:b/>
+                <w:sz w:val="20"/>
+                <w:szCs w:val="20"/>
+              </w:rPr>
+              <w:t>12</w:t>
+            </w:r>
+          </w:p>
+        </w:tc>
+        <w:tc>
+          <w:tcPr>
+            <w:tcW w:w="5839" w:type="dxa"/>
+          </w:tcPr>
+          <w:p>
+            <w:pPr>
+              <w:spacing w:before="56"/>
+              <w:ind w:left="0" w:firstLine="0"/>
+              <w:jc w:val="center"/>
+              <w:rPr>
+                <w:b/>
+                <w:sz w:val="20"/>
+                <w:szCs w:val="20"/>
+              </w:rPr>
+            </w:pPr>
+          </w:p>
+        </w:tc>
+        <w:tc>
+          <w:tcPr>
+            <w:tcW w:w="2404" w:type="dxa"/>
+          </w:tcPr>
+          <w:p>
+            <w:pPr>
+              <w:spacing w:before="56"/>
+              <w:ind w:left="0" w:firstLine="0"/>
+              <w:rPr>
+                <w:b/>
+                <w:sz w:val="20"/>
+                <w:szCs w:val="20"/>
+              </w:rPr>
+            </w:pPr>
+          </w:p>
+        </w:tc>
+      </w:tr>
+      <w:tr>
+        <w:trPr>
+          <w:trHeight w:val="174"/>
+        </w:trPr>
+        <w:tc>
+          <w:tcPr>
+            <w:tcW w:w="1543" w:type="dxa"/>
+          </w:tcPr>
+          <w:p>
+            <w:pPr>
+              <w:spacing w:before="56"/>
+              <w:ind w:left="0" w:firstLine="0"/>
+              <w:jc w:val="center"/>
+              <w:rPr>
+                <w:b/>
+                <w:sz w:val="20"/>
+                <w:szCs w:val="20"/>
+              </w:rPr>
+            </w:pPr>
+            <w:r>
+              <w:rPr>
+                <w:b/>
+                <w:sz w:val="20"/>
+                <w:szCs w:val="20"/>
+              </w:rPr>
+              <w:t>13</w:t>
+            </w:r>
+          </w:p>
+        </w:tc>
+        <w:tc>
+          <w:tcPr>
+            <w:tcW w:w="5839" w:type="dxa"/>
+          </w:tcPr>
+          <w:p>
+            <w:pPr>
+              <w:spacing w:before="56"/>
+              <w:ind w:left="0" w:firstLine="0"/>
+              <w:jc w:val="center"/>
+              <w:rPr>
+                <w:b/>
+                <w:sz w:val="20"/>
+                <w:szCs w:val="20"/>
+              </w:rPr>
+            </w:pPr>
+          </w:p>
+        </w:tc>
+        <w:tc>
+          <w:tcPr>
+            <w:tcW w:w="2404" w:type="dxa"/>
+          </w:tcPr>
+          <w:p>
+            <w:pPr>
+              <w:spacing w:before="56"/>
+              <w:ind w:left="0" w:firstLine="0"/>
+              <w:rPr>
+                <w:b/>
+                <w:sz w:val="20"/>
+                <w:szCs w:val="20"/>
+              </w:rPr>
+            </w:pPr>
+          </w:p>
+        </w:tc>
+      </w:tr>
+      <w:tr>
+        <w:trPr>
+          <w:trHeight w:val="66"/>
+        </w:trPr>
+        <w:tc>
+          <w:tcPr>
+            <w:tcW w:w="1543" w:type="dxa"/>
+          </w:tcPr>
+          <w:p>
+            <w:pPr>
+              <w:spacing w:before="56"/>
+              <w:ind w:left="0" w:firstLine="0"/>
+              <w:jc w:val="center"/>
+              <w:rPr>
+                <w:b/>
+                <w:sz w:val="20"/>
+                <w:szCs w:val="20"/>
+              </w:rPr>
+            </w:pPr>
+            <w:r>
+              <w:rPr>
+                <w:b/>
+                <w:sz w:val="20"/>
+                <w:szCs w:val="20"/>
+              </w:rPr>
+              <w:t>14</w:t>
+            </w:r>
+          </w:p>
+        </w:tc>
+        <w:tc>
+          <w:tcPr>
+            <w:tcW w:w="5839" w:type="dxa"/>
+          </w:tcPr>
+          <w:p>
+            <w:pPr>
+              <w:spacing w:before="56"/>
+              <w:ind w:left="0" w:firstLine="0"/>
+              <w:jc w:val="center"/>
+              <w:rPr>
+                <w:b/>
+                <w:sz w:val="20"/>
+                <w:szCs w:val="20"/>
+              </w:rPr>
+            </w:pPr>
+          </w:p>
+        </w:tc>
+        <w:tc>
+          <w:tcPr>
+            <w:tcW w:w="2404" w:type="dxa"/>
+          </w:tcPr>
+          <w:p>
+            <w:pPr>
+              <w:spacing w:before="56"/>
+              <w:ind w:left="0" w:firstLine="0"/>
+              <w:rPr>
+                <w:b/>
+                <w:sz w:val="20"/>
+                <w:szCs w:val="20"/>
+              </w:rPr>
+            </w:pPr>
+          </w:p>
+        </w:tc>
+      </w:tr>
+      <w:tr>
+        <w:trPr>
+          <w:trHeight w:val="76"/>
+        </w:trPr>
+        <w:tc>
+          <w:tcPr>
+            <w:tcW w:w="1543" w:type="dxa"/>
+          </w:tcPr>
+          <w:p>
+            <w:pPr>
+              <w:spacing w:before="56"/>
+              <w:ind w:left="0" w:firstLine="0"/>
+              <w:jc w:val="center"/>
+              <w:rPr>
+                <w:b/>
+                <w:sz w:val="20"/>
+                <w:szCs w:val="20"/>
+              </w:rPr>
+            </w:pPr>
+            <w:r>
+              <w:rPr>
+                <w:b/>
+                <w:sz w:val="20"/>
+                <w:szCs w:val="20"/>
+              </w:rPr>
+              <w:t>15</w:t>
+            </w:r>
+          </w:p>
+        </w:tc>
+        <w:tc>
+          <w:tcPr>
+            <w:tcW w:w="5839" w:type="dxa"/>
+          </w:tcPr>
+          <w:p>
+            <w:pPr>
+              <w:spacing w:before="56"/>
+              <w:ind w:left="0" w:firstLine="0"/>
+              <w:jc w:val="center"/>
+              <w:rPr>
+                <w:b/>
+                <w:sz w:val="20"/>
+                <w:szCs w:val="20"/>
+              </w:rPr>
+            </w:pPr>
+          </w:p>
+        </w:tc>
+        <w:tc>
+          <w:tcPr>
+            <w:tcW w:w="2404" w:type="dxa"/>
+          </w:tcPr>
+          <w:p>
+            <w:pPr>
+              <w:spacing w:before="56"/>
+              <w:ind w:left="0" w:firstLine="0"/>
+              <w:rPr>
+                <w:b/>
+                <w:sz w:val="20"/>
+                <w:szCs w:val="20"/>
+              </w:rPr>
+            </w:pPr>
+          </w:p>
+        </w:tc>
+      </w:tr>
+      <w:tr>
+        <w:trPr>
+          <w:trHeight w:val="287"/>
+        </w:trPr>
+        <w:tc>
+          <w:tcPr>
+            <w:tcW w:w="1543" w:type="dxa"/>
+          </w:tcPr>
+          <w:p>
+            <w:pPr>
+              <w:spacing w:before="56"/>
+              <w:ind w:left="0" w:firstLine="0"/>
+              <w:jc w:val="center"/>
+              <w:rPr>
+                <w:b/>
+                <w:sz w:val="20"/>
+                <w:szCs w:val="20"/>
+              </w:rPr>
+            </w:pPr>
+            <w:r>
+              <w:rPr>
+                <w:b/>
+                <w:sz w:val="20"/>
+                <w:szCs w:val="20"/>
+              </w:rPr>
+              <w:t>16</w:t>
+            </w:r>
+          </w:p>
+        </w:tc>
+        <w:tc>
+          <w:tcPr>
+            <w:tcW w:w="5839" w:type="dxa"/>
+          </w:tcPr>
+          <w:p>
+            <w:pPr>
+              <w:spacing w:before="56"/>
+              <w:ind w:left="0" w:firstLine="0"/>
+              <w:jc w:val="center"/>
+              <w:rPr>
+                <w:b/>
+                <w:sz w:val="20"/>
+                <w:szCs w:val="20"/>
+              </w:rPr>
+            </w:pPr>
+          </w:p>
+        </w:tc>
+        <w:tc>
+          <w:tcPr>
+            <w:tcW w:w="2404" w:type="dxa"/>
+          </w:tcPr>
+          <w:p>
+            <w:pPr>
+              <w:spacing w:before="56"/>
+              <w:ind w:left="0" w:firstLine="0"/>
+              <w:rPr>
+                <w:b/>
+                <w:sz w:val="20"/>
+                <w:szCs w:val="20"/>
+              </w:rPr>
+            </w:pPr>
+          </w:p>
+        </w:tc>
+      </w:tr>
+      <w:tr>
+        <w:trPr>
+          <w:trHeight w:val="167"/>
+        </w:trPr>
+        <w:tc>
+          <w:tcPr>
+            <w:tcW w:w="1543" w:type="dxa"/>
+          </w:tcPr>
+          <w:p>
+            <w:pPr>
+              <w:spacing w:before="56"/>
+              <w:ind w:left="0" w:firstLine="0"/>
+              <w:jc w:val="center"/>
+              <w:rPr>
+                <w:b/>
+                <w:sz w:val="20"/>
+                <w:szCs w:val="20"/>
+              </w:rPr>
+            </w:pPr>
+            <w:r>
+              <w:rPr>
+                <w:b/>
+                <w:sz w:val="20"/>
+                <w:szCs w:val="20"/>
+              </w:rPr>
+              <w:t>17</w:t>
+            </w:r>
+          </w:p>
+        </w:tc>
+        <w:tc>
+          <w:tcPr>
+            <w:tcW w:w="5839" w:type="dxa"/>
+          </w:tcPr>
+          <w:p>
+            <w:pPr>
+              <w:spacing w:before="56"/>
+              <w:ind w:left="0" w:firstLine="0"/>
+              <w:jc w:val="center"/>
+              <w:rPr>
+                <w:b/>
+                <w:sz w:val="20"/>
+                <w:szCs w:val="20"/>
+              </w:rPr>
+            </w:pPr>
+          </w:p>
+        </w:tc>
+        <w:tc>
+          <w:tcPr>
+            <w:tcW w:w="2404" w:type="dxa"/>
+          </w:tcPr>
+          <w:p>
+            <w:pPr>
+              <w:spacing w:before="56"/>
+              <w:ind w:left="0" w:firstLine="0"/>
+              <w:rPr>
+                <w:b/>
+                <w:sz w:val="20"/>
+                <w:szCs w:val="20"/>
+              </w:rPr>
+            </w:pPr>
+          </w:p>
+        </w:tc>
+      </w:tr>
+      <w:tr>
+        <w:trPr>
+          <w:trHeight w:val="167"/>
+        </w:trPr>
+        <w:tc>
+          <w:tcPr>
+            <w:tcW w:w="1543" w:type="dxa"/>
+          </w:tcPr>
+          <w:p>
+            <w:pPr>
+              <w:spacing w:before="56"/>
+              <w:ind w:left="0" w:firstLine="0"/>
+              <w:jc w:val="center"/>
+              <w:rPr>
+                <w:b/>
+                <w:sz w:val="20"/>
+                <w:szCs w:val="20"/>
+              </w:rPr>
+            </w:pPr>
+            <w:r>
+              <w:rPr>
+                <w:b/>
+                <w:sz w:val="20"/>
+                <w:szCs w:val="20"/>
+              </w:rPr>
+              <w:t>18</w:t>
+            </w:r>
+          </w:p>
+        </w:tc>
+        <w:tc>
+          <w:tcPr>
+            <w:tcW w:w="5839" w:type="dxa"/>
+          </w:tcPr>
+          <w:p>
+            <w:pPr>
+              <w:spacing w:before="56"/>
+              <w:ind w:left="0" w:firstLine="0"/>
+              <w:jc w:val="center"/>
+              <w:rPr>
+                <w:b/>
+                <w:sz w:val="20"/>
+                <w:szCs w:val="20"/>
+              </w:rPr>
+            </w:pPr>
+          </w:p>
+        </w:tc>
+        <w:tc>
+          <w:tcPr>
+            <w:tcW w:w="2404" w:type="dxa"/>
+          </w:tcPr>
+          <w:p>
+            <w:pPr>
+              <w:spacing w:before="56"/>
+              <w:ind w:left="0" w:firstLine="0"/>
+              <w:rPr>
+                <w:b/>
+                <w:sz w:val="20"/>
+                <w:szCs w:val="20"/>
+              </w:rPr>
+            </w:pPr>
+          </w:p>
+        </w:tc>
+      </w:tr>
+      <w:tr>
+        <w:trPr>
+          <w:trHeight w:val="167"/>
+        </w:trPr>
+        <w:tc>
+          <w:tcPr>
+            <w:tcW w:w="1543" w:type="dxa"/>
+          </w:tcPr>
+          <w:p>
+            <w:pPr>
+              <w:spacing w:before="56"/>
+              <w:ind w:left="0" w:firstLine="0"/>
+              <w:jc w:val="center"/>
+              <w:rPr>
+                <w:b/>
+                <w:sz w:val="20"/>
+                <w:szCs w:val="20"/>
+              </w:rPr>
+            </w:pPr>
+            <w:r>
+              <w:rPr>
+                <w:b/>
+                <w:sz w:val="20"/>
+                <w:szCs w:val="20"/>
+              </w:rPr>
+              <w:t>19</w:t>
+            </w:r>
+          </w:p>
+        </w:tc>
+        <w:tc>
+          <w:tcPr>
+            <w:tcW w:w="5839" w:type="dxa"/>
+          </w:tcPr>
+          <w:p>
+            <w:pPr>
+              <w:spacing w:before="56"/>
+              <w:ind w:left="0" w:firstLine="0"/>
+              <w:jc w:val="center"/>
+              <w:rPr>
+                <w:b/>
+                <w:sz w:val="20"/>
+                <w:szCs w:val="20"/>
+              </w:rPr>
+            </w:pPr>
+          </w:p>
+        </w:tc>
+        <w:tc>
+          <w:tcPr>
+            <w:tcW w:w="2404" w:type="dxa"/>
+          </w:tcPr>
+          <w:p>
+            <w:pPr>
+              <w:spacing w:before="56"/>
+              <w:ind w:left="0" w:firstLine="0"/>
+              <w:rPr>
+                <w:b/>
+                <w:sz w:val="20"/>
+                <w:szCs w:val="20"/>
+              </w:rPr>
+            </w:pPr>
+          </w:p>
+        </w:tc>
+      </w:tr>
+      <w:tr>
+        <w:trPr>
+          <w:trHeight w:val="167"/>
+        </w:trPr>
+        <w:tc>
+          <w:tcPr>
+            <w:tcW w:w="1543" w:type="dxa"/>
+          </w:tcPr>
+          <w:p>
+            <w:pPr>
+              <w:spacing w:before="56"/>
+              <w:ind w:left="0" w:firstLine="0"/>
+              <w:jc w:val="center"/>
+              <w:rPr>
+                <w:b/>
+                <w:sz w:val="20"/>
+                <w:szCs w:val="20"/>
+              </w:rPr>
+            </w:pPr>
+            <w:r>
+              <w:rPr>
+                <w:b/>
+                <w:sz w:val="20"/>
+                <w:szCs w:val="20"/>
+              </w:rPr>
+              <w:t>20</w:t>
+            </w:r>
+          </w:p>
+        </w:tc>
+        <w:tc>
+          <w:tcPr>
+            <w:tcW w:w="5839" w:type="dxa"/>
+          </w:tcPr>
+          <w:p>
+            <w:pPr>
+              <w:spacing w:before="56"/>
+              <w:ind w:left="0" w:firstLine="0"/>
+              <w:jc w:val="center"/>
+              <w:rPr>
+                <w:b/>
+                <w:sz w:val="20"/>
+                <w:szCs w:val="20"/>
+              </w:rPr>
+            </w:pPr>
+          </w:p>
+        </w:tc>
+        <w:tc>
+          <w:tcPr>
+            <w:tcW w:w="2404" w:type="dxa"/>
+          </w:tcPr>
+          <w:p>
+            <w:pPr>
+              <w:spacing w:before="56"/>
+              <w:ind w:left="0" w:firstLine="0"/>
+              <w:rPr>
+                <w:b/>
+                <w:sz w:val="20"/>
+                <w:szCs w:val="20"/>
+              </w:rPr>
+            </w:pPr>
+          </w:p>
+        </w:tc>
+      </w:tr>
+      <w:tr>
+        <w:trPr>
+          <w:trHeight w:val="167"/>
+        </w:trPr>
+        <w:tc>
+          <w:tcPr>
+            <w:tcW w:w="1543" w:type="dxa"/>
+          </w:tcPr>
+          <w:p>
+            <w:pPr>
+              <w:spacing w:before="56"/>
+              <w:ind w:left="0" w:firstLine="0"/>
+              <w:jc w:val="center"/>
+              <w:rPr>
+                <w:b/>
+                <w:sz w:val="20"/>
+                <w:szCs w:val="20"/>
+              </w:rPr>
+            </w:pPr>
+            <w:r>
+              <w:rPr>
+                <w:b/>
+                <w:sz w:val="20"/>
+                <w:szCs w:val="20"/>
+              </w:rPr>
+              <w:t>21</w:t>
+            </w:r>
+          </w:p>
+        </w:tc>
+        <w:tc>
+          <w:tcPr>
+            <w:tcW w:w="5839" w:type="dxa"/>
+          </w:tcPr>
+          <w:p>
+            <w:pPr>
+              <w:spacing w:before="56"/>
+              <w:ind w:left="0" w:firstLine="0"/>
+              <w:jc w:val="center"/>
+              <w:rPr>
+                <w:b/>
+                <w:sz w:val="20"/>
+                <w:szCs w:val="20"/>
+              </w:rPr>
+            </w:pPr>
+          </w:p>
+        </w:tc>
+        <w:tc>
+          <w:tcPr>
+            <w:tcW w:w="2404" w:type="dxa"/>
+          </w:tcPr>
+          <w:p>
+            <w:pPr>
+              <w:spacing w:before="56"/>
+              <w:ind w:left="0" w:firstLine="0"/>
+              <w:rPr>
+                <w:b/>
+                <w:sz w:val="20"/>
+                <w:szCs w:val="20"/>
+              </w:rPr>
+            </w:pPr>
+          </w:p>
+        </w:tc>
+      </w:tr>
+      <w:tr>
+        <w:trPr>
+          <w:trHeight w:val="167"/>
+        </w:trPr>
+        <w:tc>
+          <w:tcPr>
+            <w:tcW w:w="1543" w:type="dxa"/>
+          </w:tcPr>
+          <w:p>
+            <w:pPr>
+              <w:spacing w:before="56"/>
+              <w:ind w:left="0" w:firstLine="0"/>
+              <w:jc w:val="center"/>
+              <w:rPr>
+                <w:b/>
+                <w:sz w:val="20"/>
+                <w:szCs w:val="20"/>
+              </w:rPr>
+            </w:pPr>
+            <w:r>
+              <w:rPr>
+                <w:b/>
+                <w:sz w:val="20"/>
+                <w:szCs w:val="20"/>
+              </w:rPr>
+              <w:t>22</w:t>
+            </w:r>
+          </w:p>
+        </w:tc>
+        <w:tc>
+          <w:tcPr>
+            <w:tcW w:w="5839" w:type="dxa"/>
+          </w:tcPr>
+          <w:p>
+            <w:pPr>
+              <w:spacing w:before="56"/>
+              <w:ind w:left="0" w:firstLine="0"/>
+              <w:jc w:val="center"/>
+              <w:rPr>
+                <w:b/>
+                <w:sz w:val="20"/>
+                <w:szCs w:val="20"/>
+              </w:rPr>
+            </w:pPr>
+          </w:p>
+        </w:tc>
+        <w:tc>
+          <w:tcPr>
+            <w:tcW w:w="2404" w:type="dxa"/>
+          </w:tcPr>
+          <w:p>
+            <w:pPr>
+              <w:spacing w:before="56"/>
+              <w:ind w:left="0" w:firstLine="0"/>
+              <w:rPr>
+                <w:b/>
+                <w:sz w:val="20"/>
+                <w:szCs w:val="20"/>
+              </w:rPr>
+            </w:pPr>
+          </w:p>
+        </w:tc>
+      </w:tr>
+      <w:tr>
+        <w:trPr>
+          <w:trHeight w:val="167"/>
+        </w:trPr>
+        <w:tc>
+          <w:tcPr>
+            <w:tcW w:w="1543" w:type="dxa"/>
+          </w:tcPr>
+          <w:p>
+            <w:pPr>
+              <w:spacing w:before="56"/>
+              <w:ind w:left="0" w:firstLine="0"/>
+              <w:jc w:val="center"/>
+              <w:rPr>
+                <w:b/>
+                <w:sz w:val="20"/>
+                <w:szCs w:val="20"/>
+              </w:rPr>
+            </w:pPr>
+            <w:r>
+              <w:rPr>
+                <w:b/>
+                <w:sz w:val="20"/>
+                <w:szCs w:val="20"/>
+              </w:rPr>
+              <w:t>23</w:t>
+            </w:r>
+          </w:p>
+        </w:tc>
+        <w:tc>
+          <w:tcPr>
+            <w:tcW w:w="5839" w:type="dxa"/>
+          </w:tcPr>
+          <w:p>
+            <w:pPr>
+              <w:spacing w:before="56"/>
+              <w:ind w:left="0" w:firstLine="0"/>
+              <w:jc w:val="center"/>
+              <w:rPr>
+                <w:b/>
+                <w:sz w:val="20"/>
+                <w:szCs w:val="20"/>
+              </w:rPr>
+            </w:pPr>
+          </w:p>
+        </w:tc>
+        <w:tc>
+          <w:tcPr>
+            <w:tcW w:w="2404" w:type="dxa"/>
+          </w:tcPr>
+          <w:p>
+            <w:pPr>
+              <w:spacing w:before="56"/>
+              <w:ind w:left="0" w:firstLine="0"/>
+              <w:rPr>
+                <w:b/>
+                <w:sz w:val="20"/>
+                <w:szCs w:val="20"/>
+              </w:rPr>
+            </w:pPr>
+          </w:p>
+        </w:tc>
+      </w:tr>
+      <w:tr>
+        <w:trPr>
+          <w:trHeight w:val="167"/>
+        </w:trPr>
+        <w:tc>
+          <w:tcPr>
+            <w:tcW w:w="1543" w:type="dxa"/>
+          </w:tcPr>
+          <w:p>
+            <w:pPr>
+              <w:spacing w:before="56"/>
+              <w:ind w:left="0" w:firstLine="0"/>
+              <w:jc w:val="center"/>
+              <w:rPr>
+                <w:b/>
+                <w:sz w:val="20"/>
+                <w:szCs w:val="20"/>
+              </w:rPr>
+            </w:pPr>
+            <w:r>
+              <w:rPr>
+                <w:b/>
+                <w:sz w:val="20"/>
+                <w:szCs w:val="20"/>
+              </w:rPr>
+              <w:t>24</w:t>
+            </w:r>
+          </w:p>
+        </w:tc>
+        <w:tc>
+          <w:tcPr>
+            <w:tcW w:w="5839" w:type="dxa"/>
+          </w:tcPr>
+          <w:p>
+            <w:pPr>
+              <w:spacing w:before="56"/>
+              <w:ind w:left="0" w:firstLine="0"/>
+              <w:jc w:val="center"/>
+              <w:rPr>
+                <w:b/>
+                <w:sz w:val="20"/>
+                <w:szCs w:val="20"/>
+              </w:rPr>
+            </w:pPr>
+          </w:p>
+        </w:tc>
+        <w:tc>
+          <w:tcPr>
+            <w:tcW w:w="2404" w:type="dxa"/>
+          </w:tcPr>
+          <w:p>
+            <w:pPr>
+              <w:spacing w:before="56"/>
+              <w:ind w:left="0" w:firstLine="0"/>
+              <w:rPr>
+                <w:b/>
+                <w:sz w:val="20"/>
+                <w:szCs w:val="20"/>
+              </w:rPr>
+            </w:pPr>
+          </w:p>
+        </w:tc>
+      </w:tr>
+      <w:tr>
+        <w:trPr>
+          <w:trHeight w:val="167"/>
+        </w:trPr>
+        <w:tc>
+          <w:tcPr>
+            <w:tcW w:w="1543" w:type="dxa"/>
+          </w:tcPr>
+          <w:p>
+            <w:pPr>
+              <w:spacing w:before="56"/>
+              <w:ind w:left="0" w:firstLine="0"/>
+              <w:jc w:val="center"/>
+              <w:rPr>
+                <w:b/>
+                <w:sz w:val="20"/>
+                <w:szCs w:val="20"/>
+              </w:rPr>
+            </w:pPr>
+            <w:r>
+              <w:rPr>
+                <w:b/>
+                <w:sz w:val="20"/>
+                <w:szCs w:val="20"/>
+              </w:rPr>
+              <w:t>25</w:t>
+            </w:r>
+          </w:p>
+        </w:tc>
+        <w:tc>
+          <w:tcPr>
+            <w:tcW w:w="5839" w:type="dxa"/>
+          </w:tcPr>
+          <w:p>
+            <w:pPr>
+              <w:spacing w:before="56"/>
+              <w:ind w:left="0" w:firstLine="0"/>
+              <w:jc w:val="center"/>
+              <w:rPr>
+                <w:b/>
+                <w:sz w:val="20"/>
+                <w:szCs w:val="20"/>
+              </w:rPr>
+            </w:pPr>
+          </w:p>
+        </w:tc>
+        <w:tc>
+          <w:tcPr>
+            <w:tcW w:w="2404" w:type="dxa"/>
+          </w:tcPr>
+          <w:p>
+            <w:pPr>
+              <w:spacing w:before="56"/>
+              <w:ind w:left="0" w:firstLine="0"/>
+              <w:rPr>
+                <w:b/>
+                <w:sz w:val="20"/>
+                <w:szCs w:val="20"/>
+              </w:rPr>
+            </w:pPr>
+          </w:p>
+        </w:tc>
+      </w:tr>
+      <w:tr>
+        <w:trPr>
+          <w:trHeight w:val="167"/>
+        </w:trPr>
+        <w:tc>
+          <w:tcPr>
+            <w:tcW w:w="1543" w:type="dxa"/>
+          </w:tcPr>
+          <w:p>
+            <w:pPr>
+              <w:spacing w:before="56"/>
+              <w:ind w:left="0" w:firstLine="0"/>
+              <w:jc w:val="center"/>
+              <w:rPr>
+                <w:b/>
+                <w:sz w:val="20"/>
+                <w:szCs w:val="20"/>
+              </w:rPr>
+            </w:pPr>
+            <w:r>
+              <w:rPr>
+                <w:b/>
+                <w:sz w:val="20"/>
+                <w:szCs w:val="20"/>
+              </w:rPr>
+              <w:t>26</w:t>
+            </w:r>
+          </w:p>
+        </w:tc>
+        <w:tc>
+          <w:tcPr>
+            <w:tcW w:w="5839" w:type="dxa"/>
+          </w:tcPr>
+          <w:p>
+            <w:pPr>
+              <w:spacing w:before="56"/>
+              <w:ind w:left="0" w:firstLine="0"/>
+              <w:jc w:val="center"/>
+              <w:rPr>
+                <w:b/>
+                <w:sz w:val="20"/>
+                <w:szCs w:val="20"/>
+              </w:rPr>
+            </w:pPr>
+          </w:p>
+        </w:tc>
+        <w:tc>
+          <w:tcPr>
+            <w:tcW w:w="2404" w:type="dxa"/>
+          </w:tcPr>
+          <w:p>
+            <w:pPr>
+              <w:spacing w:before="56"/>
+              <w:ind w:left="0" w:firstLine="0"/>
+              <w:rPr>
+                <w:b/>
+                <w:sz w:val="20"/>
+                <w:szCs w:val="20"/>
+              </w:rPr>
+            </w:pPr>
+          </w:p>
+        </w:tc>
+      </w:tr>
+      <w:tr>
+        <w:trPr>
+          <w:trHeight w:val="167"/>
+        </w:trPr>
+        <w:tc>
+          <w:tcPr>
+            <w:tcW w:w="1543" w:type="dxa"/>
+          </w:tcPr>
+          <w:p>
+            <w:pPr>
+              <w:spacing w:before="56"/>
+              <w:ind w:left="0" w:firstLine="0"/>
+              <w:jc w:val="center"/>
+              <w:rPr>
+                <w:b/>
+                <w:sz w:val="20"/>
+                <w:szCs w:val="20"/>
+              </w:rPr>
+            </w:pPr>
+            <w:r>
+              <w:rPr>
+                <w:b/>
+                <w:sz w:val="20"/>
+                <w:szCs w:val="20"/>
+              </w:rPr>
+              <w:t>27</w:t>
+            </w:r>
+          </w:p>
+        </w:tc>
+        <w:tc>
+          <w:tcPr>
+            <w:tcW w:w="5839" w:type="dxa"/>
+          </w:tcPr>
+          <w:p>
+            <w:pPr>
+              <w:spacing w:before="56"/>
+              <w:ind w:left="0" w:firstLine="0"/>
+              <w:jc w:val="center"/>
+              <w:rPr>
+                <w:b/>
+                <w:sz w:val="20"/>
+                <w:szCs w:val="20"/>
+              </w:rPr>
+            </w:pPr>
+          </w:p>
+        </w:tc>
+        <w:tc>
+          <w:tcPr>
+            <w:tcW w:w="2404" w:type="dxa"/>
+          </w:tcPr>
+          <w:p>
+            <w:pPr>
+              <w:spacing w:before="56"/>
+              <w:ind w:left="0" w:firstLine="0"/>
+              <w:rPr>
+                <w:b/>
+                <w:sz w:val="20"/>
+                <w:szCs w:val="20"/>
+              </w:rPr>
+            </w:pPr>
+          </w:p>
+        </w:tc>
+      </w:tr>
+      <w:tr>
+        <w:trPr>
+          <w:trHeight w:val="167"/>
+        </w:trPr>
+        <w:tc>
+          <w:tcPr>
+            <w:tcW w:w="1543" w:type="dxa"/>
+          </w:tcPr>
+          <w:p>
+            <w:pPr>
+              <w:spacing w:before="56"/>
+              <w:ind w:left="0" w:firstLine="0"/>
+              <w:jc w:val="center"/>
+              <w:rPr>
+                <w:b/>
+                <w:sz w:val="20"/>
+                <w:szCs w:val="20"/>
+              </w:rPr>
+            </w:pPr>
+            <w:r>
+              <w:rPr>
+                <w:b/>
+                <w:sz w:val="20"/>
+                <w:szCs w:val="20"/>
+              </w:rPr>
+              <w:t>28</w:t>
+            </w:r>
+          </w:p>
+        </w:tc>
+        <w:tc>
+          <w:tcPr>
+            <w:tcW w:w="5839" w:type="dxa"/>
+          </w:tcPr>
+          <w:p>
+            <w:pPr>
+              <w:spacing w:before="56"/>
+              <w:ind w:left="0" w:firstLine="0"/>
+              <w:jc w:val="center"/>
+              <w:rPr>
+                <w:b/>
+                <w:sz w:val="20"/>
+                <w:szCs w:val="20"/>
+              </w:rPr>
+            </w:pPr>
+          </w:p>
+        </w:tc>
+        <w:tc>
+          <w:tcPr>
+            <w:tcW w:w="2404" w:type="dxa"/>
+          </w:tcPr>
+          <w:p>
+            <w:pPr>
+              <w:spacing w:before="56"/>
+              <w:ind w:left="0" w:firstLine="0"/>
+              <w:rPr>
+                <w:b/>
+                <w:sz w:val="20"/>
+                <w:szCs w:val="20"/>
+              </w:rPr>
+            </w:pPr>
+          </w:p>
+        </w:tc>
+      </w:tr>
+      <w:tr>
+        <w:trPr>
+          <w:trHeight w:val="167"/>
+        </w:trPr>
+        <w:tc>
+          <w:tcPr>
+            <w:tcW w:w="1543" w:type="dxa"/>
+          </w:tcPr>
+          <w:p>
+            <w:pPr>
+              <w:spacing w:before="56"/>
+              <w:ind w:left="0" w:firstLine="0"/>
+              <w:jc w:val="center"/>
+              <w:rPr>
+                <w:b/>
+                <w:sz w:val="20"/>
+                <w:szCs w:val="20"/>
+              </w:rPr>
+            </w:pPr>
+            <w:r>
+              <w:rPr>
+                <w:b/>
+                <w:sz w:val="20"/>
+                <w:szCs w:val="20"/>
+              </w:rPr>
+              <w:t>29</w:t>
+            </w:r>
+          </w:p>
+        </w:tc>
+        <w:tc>
+          <w:tcPr>
+            <w:tcW w:w="5839" w:type="dxa"/>
+          </w:tcPr>
+          <w:p>
+            <w:pPr>
+              <w:spacing w:before="56"/>
+              <w:ind w:left="0" w:firstLine="0"/>
+              <w:jc w:val="center"/>
+              <w:rPr>
+                <w:b/>
+                <w:sz w:val="20"/>
+                <w:szCs w:val="20"/>
+              </w:rPr>
+            </w:pPr>
+          </w:p>
+        </w:tc>
+        <w:tc>
+          <w:tcPr>
+            <w:tcW w:w="2404" w:type="dxa"/>
+          </w:tcPr>
+          <w:p>
+            <w:pPr>
+              <w:spacing w:before="56"/>
+              <w:ind w:left="0" w:firstLine="0"/>
+              <w:rPr>
+                <w:b/>
+                <w:sz w:val="20"/>
+                <w:szCs w:val="20"/>
+              </w:rPr>
+            </w:pPr>
           </w:p>
         </w:tc>
       </w:tr>
     </w:tbl>
     <w:p>
       <w:pPr>
-        <w:tabs>
-          <w:tab w:val="left" w:pos="2612"/>
-        </w:tabs>
+        <w:spacing w:before="56"/>
+        <w:ind w:left="444"/>
         <w:jc w:val="center"/>
+        <w:rPr>
+          <w:b/>
+          <w:sz w:val="36"/>
+        </w:rPr>
       </w:pPr>
     </w:p>
     <w:p>
       <w:pPr>
-        <w:tabs>
-          <w:tab w:val="left" w:pos="2612"/>
-        </w:tabs>
+        <w:spacing w:before="56"/>
+        <w:ind w:left="444"/>
         <w:jc w:val="center"/>
+        <w:rPr>
+          <w:b/>
+          <w:sz w:val="36"/>
+        </w:rPr>
       </w:pPr>
     </w:p>
     <w:p>
       <w:pPr>
-        <w:tabs>
-          <w:tab w:val="left" w:pos="9053"/>
-        </w:tabs>
-        <w:jc w:val="left"/>
-      </w:pPr>
-      <w:r>
-        <w:tab/>
-      </w:r>
-      <w:r>
-        <w:tab/>
-      </w:r>
+        <w:spacing w:before="56"/>
+        <w:ind w:left="444"/>
+        <w:jc w:val="center"/>
+        <w:rPr>
+          <w:b/>
+          <w:sz w:val="36"/>
+        </w:rPr>
+      </w:pPr>
     </w:p>
     <w:p>
       <w:pPr>
+        <w:spacing w:before="56"/>
+        <w:ind w:left="444"/>
         <w:jc w:val="center"/>
-      </w:pPr>
-    </w:p>
-    <w:p>
-      <w:pPr>
-        <w:jc w:val="center"/>
-      </w:pPr>
-    </w:p>
-    <w:p>
-      <w:pPr>
-        <w:jc w:val="center"/>
-      </w:pPr>
-    </w:p>
-    <w:p>
-      <w:pPr>
-        <w:jc w:val="center"/>
-      </w:pPr>
-    </w:p>
-    <w:p>
-      <w:pPr>
-        <w:jc w:val="center"/>
-      </w:pPr>
-    </w:p>
-    <w:p/>
-    <w:p/>
-    <w:p/>
-    <w:p/>
-    <w:p/>
-    <w:p/>
-    <w:p/>
-    <w:p/>
-    <w:p/>
-    <w:p/>
-    <w:p>
-      <w:pPr>
-        <w:jc w:val="center"/>
-      </w:pPr>
-    </w:p>
-    <w:p>
-      <w:pPr>
-        <w:jc w:val="center"/>
-      </w:pPr>
-    </w:p>
-    <w:p>
-      <w:pPr>
-        <w:jc w:val="center"/>
-      </w:pPr>
-    </w:p>
-    <w:p>
-      <w:pPr>
-        <w:jc w:val="center"/>
-      </w:pPr>
-    </w:p>
-    <w:p>
-      <w:pPr>
-        <w:jc w:val="center"/>
-      </w:pPr>
-    </w:p>
-    <w:p>
-      <w:pPr>
-        <w:jc w:val="center"/>
-      </w:pPr>
-    </w:p>
-    <w:p>
-      <w:pPr>
-        <w:jc w:val="center"/>
-      </w:pPr>
-    </w:p>
-    <w:p>
-      <w:pPr>
-        <w:jc w:val="center"/>
-      </w:pPr>
-    </w:p>
-    <w:p>
-      <w:pPr>
-        <w:jc w:val="center"/>
-      </w:pPr>
-    </w:p>
-    <w:p>
-      <w:pPr>
-        <w:jc w:val="center"/>
-      </w:pPr>
-    </w:p>
-    <w:p>
-      <w:pPr>
-        <w:jc w:val="center"/>
-      </w:pPr>
-    </w:p>
-    <w:p>
-      <w:pPr>
-        <w:jc w:val="center"/>
-      </w:pPr>
-    </w:p>
-    <w:p>
-      <w:pPr>
-        <w:jc w:val="center"/>
-      </w:pPr>
-    </w:p>
-    <w:p>
-      <w:pPr>
-        <w:jc w:val="center"/>
-      </w:pPr>
-    </w:p>
-    <w:p>
-      <w:pPr>
-        <w:jc w:val="center"/>
-      </w:pPr>
-    </w:p>
-    <w:p>
-      <w:pPr>
-        <w:jc w:val="center"/>
-      </w:pPr>
-    </w:p>
-    <w:p>
-      <w:pPr>
-        <w:jc w:val="center"/>
-      </w:pPr>
-    </w:p>
-    <w:p>
-      <w:pPr>
-        <w:ind w:left="0" w:firstLine="0"/>
+        <w:rPr>
+          <w:b/>
+          <w:sz w:val="36"/>
+        </w:rPr>
       </w:pPr>
     </w:p>
     <w:p>
@@ -2353,6 +4045,7 @@
       <w:tblGrid>
         <w:gridCol w:w="2299"/>
         <w:gridCol w:w="3649"/>
+        <w:gridCol w:w="3649"/>
         <w:gridCol w:w="2236"/>
       </w:tblGrid>
       <w:tr>
@@ -2397,6 +4090,23 @@
               </w:rPr>
               <w:t>No.</w:t>
             </w:r>
+          </w:p>
+        </w:tc>
+        <w:tc>
+          <w:tcPr>
+            <w:tcW w:w="3649" w:type="dxa"/>
+          </w:tcPr>
+          <w:p>
+            <w:pPr>
+              <w:pStyle w:val="TableParagraph"/>
+              <w:spacing w:line="291" w:lineRule="exact"/>
+              <w:ind w:left="1107"/>
+              <w:rPr>
+                <w:b/>
+                <w:spacing w:val="-4"/>
+                <w:sz w:val="28"/>
+              </w:rPr>
+            </w:pPr>
           </w:p>
         </w:tc>
         <w:tc>
@@ -2610,13 +4320,8 @@
           <w:fldChar w:fldCharType="separate"/>
         </w:r>
         <w:r>
-          <w:t>i</w:t>
+          <w:t>ii</w:t>
         </w:r>
-        <w:proofErr w:type="spellStart"/>
-        <w:r>
-          <w:t>i</w:t>
-        </w:r>
-        <w:proofErr w:type="spellEnd"/>
         <w:r>
           <w:rPr>
             <w:noProof/>
@@ -4448,6 +6153,25 @@
       <w14:ligatures w14:val="none"/>
     </w:rPr>
   </w:style>
+  <w:style w:type="table" w:styleId="TableGrid">
+    <w:name w:val="Table Grid"/>
+    <w:basedOn w:val="TableNormal"/>
+    <w:uiPriority w:val="39"/>
+    <w:rsid w:val="005A1D13"/>
+    <w:pPr>
+      <w:spacing w:after="0" w:line="240" w:lineRule="auto"/>
+    </w:pPr>
+    <w:tblPr>
+      <w:tblBorders>
+        <w:top w:val="single" w:sz="4" w:space="0" w:color="auto"/>
+        <w:left w:val="single" w:sz="4" w:space="0" w:color="auto"/>
+        <w:bottom w:val="single" w:sz="4" w:space="0" w:color="auto"/>
+        <w:right w:val="single" w:sz="4" w:space="0" w:color="auto"/>
+        <w:insideH w:val="single" w:sz="4" w:space="0" w:color="auto"/>
+        <w:insideV w:val="single" w:sz="4" w:space="0" w:color="auto"/>
+      </w:tblBorders>
+    </w:tblPr>
+  </w:style>
 </w:styles>
 </file>
 

</xml_diff>